<commit_message>
Currere dates: First Draft Tue Oct 20, Final Draft Mon Nov 2
Humans first: the draft goes to Monday's peer review, then Todd-in-a-Can,
then turns in with the conference cover page. The cover page and the
booking name ONE thing to work on. Adds a Where We're Going map, linked
from Week 8 Monday, and updates the guidelines, Weeks 6-10, and the
grading table to match.

Co-Authored-By: Claude Opus 5.5 <noreply@anthropic.com>
</commit_message>
<xml_diff>
--- a/week-08-dramatize-and-break-rules/Currere First Draft.docx
+++ b/week-08-dramatize-and-break-rules/Currere First Draft.docx
@@ -73,7 +73,7 @@
           <w:sz w:val="22"/>
           <w:szCs w:val="22"/>
         </w:rPr>
-        <w:t>By now you have your thread, your storyboard, and six rough scenes. The First Draft is the first time your currere exists as one whole piece, start to finish. It doesn’t need to be polished — it needs to be complete and real. It’s due Friday, October 16.</w:t>
+        <w:t>By now you have your thread, your storyboard, and six rough scenes. The First Draft is the first time your currere exists as one whole piece, start to finish. It doesn’t need to be polished — it needs to be complete and real. It’s due Tuesday, October 20, at 11:59 p.m. — after Monday’s peer review.</w:t>
       </w:r>
     </w:p>
     <w:p>
@@ -212,7 +212,7 @@
           <w:sz w:val="22"/>
           <w:szCs w:val="22"/>
         </w:rPr>
-        <w:t>All six scenes, plus a real attempt at the synthetical close. Export as a single PDF and submit to Canvas by Friday, October 16, with your AI-use log and your Todd-in-a-Can review.</w:t>
+        <w:t>All six scenes, plus a real attempt at the synthetical close. Export as a single PDF and submit to Canvas by Tuesday, October 20, at 11:59 p.m., with your AI-use log, your Todd-in-a-Can review, and your Draft Conference cover page.</w:t>
       </w:r>
     </w:p>
     <w:p>
@@ -541,7 +541,7 @@
                 <w:sz w:val="22"/>
                 <w:szCs w:val="22"/>
               </w:rPr>
-              <w:t xml:space="preserve">Talk like Todd. Short, plain, warm, direct. Say what is working first, in specifics. Then name the one or two things that would most help the draft, as questions where you can. End by asking what they most want to work on before the next draft.</w:t>
+              <w:t xml:space="preserve">Talk like Todd. Short, plain, warm, direct. Say what is working first, in specifics. Then name the one or two things that would most help the draft, as questions where you can. End by asking what ONE thing they most want to talk about at their conference.</w:t>
             </w:r>
           </w:p>
           <w:p>

</xml_diff>

<commit_message>
Week 8: Mystery Poem gets 20 minutes, the map becomes a calendar, the conference joins the First Draft
Monday opens with Where We're Going, then the mystery poem with time to
steal the move; section 2 drops its last write. The First Draft is now
15 points with the Draft Conference folded in.

Co-Authored-By: Claude Opus 5.5 <noreply@anthropic.com>
</commit_message>
<xml_diff>
--- a/week-08-dramatize-and-break-rules/Currere First Draft.docx
+++ b/week-08-dramatize-and-break-rules/Currere First Draft.docx
@@ -44,7 +44,7 @@
           <w:sz w:val="24"/>
           <w:szCs w:val="22"/>
         </w:rPr>
-        <w:t>10 points possible</w:t>
+        <w:t>15 points possible</w:t>
       </w:r>
     </w:p>
     <w:p>
@@ -183,7 +183,34 @@
           <w:sz w:val="22"/>
           <w:szCs w:val="22"/>
         </w:rPr>
-        <w:t xml:space="preserve"> Send the draft through the AI studio tool and submit its review with your draft.</w:t>
+        <w:t xml:space="preserve"> After Monday’s peer review — human readers first — send the draft through the AI studio tool and submit its review with your draft.</w:t>
+      </w:r>
+    </w:p>
+    <w:p>
+      <w:pPr>
+        <w:numPr>
+          <w:ilvl w:val="0"/>
+          <w:numId w:val="1"/>
+        </w:numPr>
+        <w:spacing w:after="200" w:line="276" w:lineRule="auto"/>
+      </w:pPr>
+      <w:r>
+        <w:rPr>
+          <w:rFonts w:ascii="Calibri" w:hAnsi="Calibri" w:eastAsia="Calibri" w:cs="Calibri"/>
+          <w:b/>
+          <w:bCs/>
+          <w:sz w:val="22"/>
+          <w:szCs w:val="22"/>
+        </w:rPr>
+        <w:t>Name your ONE thing and come to your conference.</w:t>
+      </w:r>
+      <w:r>
+        <w:rPr>
+          <w:rFonts w:ascii="Calibri" w:hAnsi="Calibri" w:eastAsia="Calibri" w:cs="Calibri"/>
+          <w:sz w:val="22"/>
+          <w:szCs w:val="22"/>
+        </w:rPr>
+        <w:t xml:space="preserve"> On a one-page cover page, name the one thing about your draft you most want to talk about — a place or a move you can point to — with what your peer group and Todd-in-a-Can said. Book your 15 minutes (Wed Oct 21 or Thu Oct 22) and come. The Draft Conference guideline has the details.</w:t>
       </w:r>
     </w:p>
     <w:p>
@@ -212,7 +239,7 @@
           <w:sz w:val="22"/>
           <w:szCs w:val="22"/>
         </w:rPr>
-        <w:t>All six scenes, plus a real attempt at the synthetical close. Export as a single PDF and submit to Canvas by Tuesday, October 20, at 11:59 p.m., with your AI-use log, your Todd-in-a-Can review, and your Draft Conference cover page.</w:t>
+        <w:t>All six scenes, plus a real attempt at the synthetical close. Export as a single PDF and submit to Canvas by Tuesday, October 20, at 11:59 p.m., with your AI-use log, your Todd-in-a-Can review, and your cover page. No grace period on this one — I need your draft before our conferences.</w:t>
       </w:r>
     </w:p>
     <w:p>
@@ -379,6 +406,70 @@
                 <w:szCs w:val="22"/>
               </w:rPr>
               <w:t>You ran the draft through the AI studio tool and submitted its review with your draft.</w:t>
+            </w:r>
+          </w:p>
+        </w:tc>
+      </w:tr>
+      <w:tr>
+        <w:tc>
+          <w:tcPr>
+            <w:tcW w:w="1995" w:type="dxa"/>
+            <w:tcBorders>
+              <w:top w:val="single" w:sz="4" w:space="0" w:color="auto"/>
+              <w:left w:val="single" w:sz="4" w:space="0" w:color="auto"/>
+              <w:bottom w:val="single" w:sz="4" w:space="0" w:color="auto"/>
+              <w:right w:val="single" w:sz="4" w:space="0" w:color="auto"/>
+            </w:tcBorders>
+            <w:tcMar>
+              <w:top w:w="100" w:type="dxa"/>
+              <w:left w:w="100" w:type="dxa"/>
+              <w:bottom w:w="100" w:type="dxa"/>
+              <w:right w:w="100" w:type="dxa"/>
+            </w:tcMar>
+          </w:tcPr>
+          <w:p>
+            <w:pPr>
+              <w:spacing w:after="200" w:line="276" w:lineRule="auto"/>
+            </w:pPr>
+            <w:r>
+              <w:rPr>
+                <w:rFonts w:ascii="Calibri" w:hAnsi="Calibri" w:eastAsia="Calibri" w:cs="Calibri"/>
+                <w:b/>
+                <w:bCs/>
+                <w:sz w:val="22"/>
+                <w:szCs w:val="22"/>
+              </w:rPr>
+              <w:t>Draft Conference (5)</w:t>
+            </w:r>
+          </w:p>
+        </w:tc>
+        <w:tc>
+          <w:tcPr>
+            <w:tcW w:w="8805" w:type="dxa"/>
+            <w:tcBorders>
+              <w:top w:val="single" w:sz="4" w:space="0" w:color="auto"/>
+              <w:left w:val="single" w:sz="4" w:space="0" w:color="auto"/>
+              <w:bottom w:val="single" w:sz="4" w:space="0" w:color="auto"/>
+              <w:right w:val="single" w:sz="4" w:space="0" w:color="auto"/>
+            </w:tcBorders>
+            <w:tcMar>
+              <w:top w:w="100" w:type="dxa"/>
+              <w:left w:w="100" w:type="dxa"/>
+              <w:bottom w:w="100" w:type="dxa"/>
+              <w:right w:w="100" w:type="dxa"/>
+            </w:tcMar>
+          </w:tcPr>
+          <w:p>
+            <w:pPr>
+              <w:spacing w:after="200" w:line="276" w:lineRule="auto"/>
+            </w:pPr>
+            <w:r>
+              <w:rPr>
+                <w:rFonts w:ascii="Calibri" w:hAnsi="Calibri" w:eastAsia="Calibri" w:cs="Calibri"/>
+                <w:sz w:val="22"/>
+                <w:szCs w:val="22"/>
+              </w:rPr>
+              <w:t>Your cover page names ONE thing you can point to, and you came to your 15-minute conference.</w:t>
             </w:r>
           </w:p>
         </w:tc>

</xml_diff>